<commit_message>
Update Software Project Plan Outline.docx
</commit_message>
<xml_diff>
--- a/Software Project Plan Outline.docx
+++ b/Software Project Plan Outline.docx
@@ -920,38 +920,37 @@
       <w:r>
         <w:t xml:space="preserve"> Our deal tracker will connect to various gaming storefronts hosted on the web. This will naturally include Amazon, Steam, Nintendo eShop, </w:t>
       </w:r>
+      <w:r>
+        <w:t>PlayStation</w:t>
+      </w:r>
+      <w:r>
+        <w:t xml:space="preserve"> Store, and the Microsoft Store, covering the core storefronts used by PC, Nintendo, </w:t>
+      </w:r>
+      <w:r>
+        <w:t>PlayStation</w:t>
+      </w:r>
+      <w:r>
+        <w:t>, and Xbox gamers. Through the summation of these storefronts, users will be able to find what platform a video game is the cheapest, which is quite important as many gamers nowadays have multiple gaming systems. When a deal is located, it will shift the user to the linked website. Think of it like those deal browser add-ons which suggest cheaper websites to buy a product on when you go online shopping. Except, in this case, as we host software dedicated to the feature we will allow for better deal-tracking</w:t>
+      </w:r>
+      <w:r>
+        <w:t xml:space="preserve">. Users will be able to start the search at </w:t>
+      </w:r>
       <w:proofErr w:type="spellStart"/>
       <w:r>
-        <w:t>Playstation</w:t>
+        <w:t>EzPlay</w:t>
       </w:r>
       <w:proofErr w:type="spellEnd"/>
       <w:r>
-        <w:t xml:space="preserve"> Store, and the Microsoft Store, covering the core storefronts used by PC, Nintendo, </w:t>
-      </w:r>
-      <w:proofErr w:type="spellStart"/>
-      <w:r>
-        <w:t>Playstation</w:t>
-      </w:r>
-      <w:proofErr w:type="spellEnd"/>
-      <w:r>
-        <w:t>, and Xbox gamers. Through the summation of these storefronts, users will be able to find what platform a video game is the cheapest, which is quite important as many gamers nowadays have multiple gaming systems. When a deal is located, it will shift the user to the</w:t>
-      </w:r>
-      <w:r>
-        <w:t xml:space="preserve"> linked website. Think of it like those deal browser add-ons which suggest cheaper websites to buy a product on when you go online shopping. Except, in this case, as we host software dedicated to the feature we will allow for better deal-tracking. Users will be able to start the search at </w:t>
-      </w:r>
-      <w:proofErr w:type="spellStart"/>
-      <w:r>
-        <w:t>EzPlay</w:t>
-      </w:r>
-      <w:proofErr w:type="spellEnd"/>
-      <w:r>
         <w:t xml:space="preserve"> to already get a step ahead on finding the best deals. Users will be able to favorite a game and receive notifications when it goes on sale on any </w:t>
       </w:r>
       <w:r>
         <w:t>storefront and</w:t>
       </w:r>
       <w:r>
-        <w:t xml:space="preserve"> even be able to see its lowest recorded price to know when a game could go on an even lower sale before buying. We will also have the compatibility to later-add physical stores such as Walmart or BestBuy, as these stores also have large gaming discounts, and typically host more unique deals and promotions when compared to online gaming storefronts. To sum it all up, the deal tracker will be designed for users to get the most bang for their buck.</w:t>
+        <w:t xml:space="preserve"> even be able to see its lowest recorded price to know when a game could go on an even lower sale before buying. We will also have the compatibility to later-add physical stores such as Walmart or BestBuy, as these stores also have large gaming discounts, and typically host more unique deals and pro</w:t>
+      </w:r>
+      <w:r>
+        <w:t>motions when compared to online gaming storefronts. To sum it all up, the deal tracker will be designed for users to get the most bang for their buck.</w:t>
       </w:r>
     </w:p>
     <w:p/>
@@ -1076,13 +1075,19 @@
         <w:t>that, like</w:t>
       </w:r>
       <w:r>
-        <w:t xml:space="preserve"> normal cloud gaming but even more extreme here, a strong network both ways is required. However, in addition to this simpler feature, we will also have an enhanced version available in which friend #1 connects to a game through our cloud gaming service on a specific </w:t>
+        <w:t xml:space="preserve"> normal cloud gaming but even more extr</w:t>
+      </w:r>
+      <w:r>
+        <w:t xml:space="preserve">eme here, a strong network both ways is required. However, in addition to this simpler feature, we will also have an enhanced version available in which friend #1 connects to a game through our cloud gaming service on a specific </w:t>
       </w:r>
       <w:r>
         <w:t>system and</w:t>
       </w:r>
       <w:r>
-        <w:t xml:space="preserve"> can invite friend #2 to the same system and play a multiplayer game. This way, only direct connection to our very strong cloud gaming network is required. It is likely that the basic cloud gaming service in addition to this invite feature would be locked behind a subscription (and only 1 friend will need to own the subscription to invite another), however the basic user-to-user cloud gaming feature will be available for free.</w:t>
+        <w:t xml:space="preserve"> can invite friend #2 to the same system and play a multiplayer game. This way, only direct connection to our very strong cloud gaming network is required. It is likely that the basic cloud gaming service in addition to this invite feature would be locked behind a subscrip</w:t>
+      </w:r>
+      <w:r>
+        <w:t>tion (and only 1 friend will need to own the subscription to invite another), however the basic user-to-user cloud gaming feature will be available for free.</w:t>
       </w:r>
     </w:p>
     <w:p/>
@@ -1109,16 +1114,11 @@
       <w:r>
         <w:t xml:space="preserve"> will have a simple clip system to capture any funny moments experienced while playing with others (or playing in general). Users will be able to customize clip length and give it a </w:t>
       </w:r>
-      <w:proofErr w:type="spellStart"/>
-      <w:r>
-        <w:t>keybind</w:t>
-      </w:r>
-      <w:proofErr w:type="spellEnd"/>
-      <w:r>
-        <w:t xml:space="preserve">, and there will be an extra in-app feature to modify recent clips before exporting them out. Say </w:t>
-      </w:r>
-      <w:r>
-        <w:t xml:space="preserve">you have your clip sent to go a minute back just in </w:t>
+      <w:r>
+        <w:t>key bind</w:t>
+      </w:r>
+      <w:r>
+        <w:t xml:space="preserve">, and there will be an extra in-app feature to modify recent clips before exporting them out. Say you have your clip sent to go a minute back just in </w:t>
       </w:r>
       <w:r>
         <w:t>case,</w:t>
@@ -1245,28 +1245,257 @@
     </w:p>
     <w:p>
       <w:r>
+        <w:rPr>
+          <w:b/>
+          <w:bCs/>
+        </w:rPr>
         <w:t>Michael Fuentes - Project Leader</w:t>
       </w:r>
-    </w:p>
-    <w:p>
-      <w:r>
+      <w:r>
+        <w:rPr>
+          <w:b/>
+          <w:bCs/>
+        </w:rPr>
+        <w:t>/Team Lead</w:t>
+      </w:r>
+      <w:r>
+        <w:rPr>
+          <w:b/>
+          <w:bCs/>
+        </w:rPr>
+        <w:t>:</w:t>
+      </w:r>
+      <w:r>
+        <w:t xml:space="preserve"> Responsible for assigning team members to tasks, com</w:t>
+      </w:r>
+      <w:r>
+        <w:t xml:space="preserve">municating with upper management, and getting documents </w:t>
+      </w:r>
+      <w:r>
+        <w:t>submitted in</w:t>
+      </w:r>
+      <w:r>
+        <w:t xml:space="preserve"> a timely manner.  </w:t>
+      </w:r>
+      <w:r>
+        <w:t>Also,</w:t>
+      </w:r>
+      <w:r>
+        <w:t xml:space="preserve"> </w:t>
+      </w:r>
+      <w:r>
+        <w:t>in charge of making sure everyone understands what is required of them</w:t>
+      </w:r>
+      <w:r>
+        <w:t xml:space="preserve"> and will assist team members who need guidance.</w:t>
+      </w:r>
+    </w:p>
+    <w:p/>
+    <w:p>
+      <w:r>
+        <w:rPr>
+          <w:b/>
+          <w:bCs/>
+        </w:rPr>
         <w:t>Christopher Ledford - Schedule Manager</w:t>
       </w:r>
-    </w:p>
-    <w:p>
-      <w:r>
+      <w:r>
+        <w:rPr>
+          <w:b/>
+          <w:bCs/>
+        </w:rPr>
+        <w:t xml:space="preserve">/Product </w:t>
+      </w:r>
+      <w:r>
+        <w:rPr>
+          <w:b/>
+          <w:bCs/>
+        </w:rPr>
+        <w:t>Specialist</w:t>
+      </w:r>
+      <w:r>
+        <w:rPr>
+          <w:b/>
+          <w:bCs/>
+        </w:rPr>
+        <w:t xml:space="preserve">: </w:t>
+      </w:r>
+      <w:r>
+        <w:t>Responsible for</w:t>
+      </w:r>
+      <w:r>
+        <w:t xml:space="preserve"> updating our team Trello board with necessary </w:t>
+      </w:r>
+      <w:r>
+        <w:t>due dates</w:t>
+      </w:r>
+      <w:r>
+        <w:t>.</w:t>
+      </w:r>
+      <w:r>
+        <w:t xml:space="preserve">  Also familiar with</w:t>
+      </w:r>
+      <w:r>
+        <w:t xml:space="preserve"> </w:t>
+      </w:r>
+      <w:r>
+        <w:t xml:space="preserve">the ins and outs of the </w:t>
+      </w:r>
+      <w:r>
+        <w:t>product</w:t>
+      </w:r>
+      <w:r>
+        <w:t xml:space="preserve">, in particular, </w:t>
+      </w:r>
+      <w:r>
+        <w:t xml:space="preserve">system </w:t>
+      </w:r>
+      <w:r>
+        <w:t xml:space="preserve">specifications </w:t>
+      </w:r>
+      <w:r>
+        <w:t xml:space="preserve">and </w:t>
+      </w:r>
+      <w:r>
+        <w:t>features.</w:t>
+      </w:r>
+    </w:p>
+    <w:p>
+      <w:pPr>
+        <w:rPr>
+          <w:b/>
+          <w:bCs/>
+        </w:rPr>
+      </w:pPr>
+    </w:p>
+    <w:p>
+      <w:r>
+        <w:rPr>
+          <w:b/>
+          <w:bCs/>
+        </w:rPr>
         <w:t xml:space="preserve">Emirhan </w:t>
       </w:r>
       <w:proofErr w:type="spellStart"/>
       <w:r>
+        <w:rPr>
+          <w:b/>
+          <w:bCs/>
+        </w:rPr>
         <w:t>Tektas</w:t>
       </w:r>
       <w:proofErr w:type="spellEnd"/>
       <w:r>
+        <w:rPr>
+          <w:b/>
+          <w:bCs/>
+        </w:rPr>
         <w:t xml:space="preserve"> - File Manager</w:t>
       </w:r>
+      <w:r>
+        <w:rPr>
+          <w:b/>
+          <w:bCs/>
+        </w:rPr>
+        <w:t>/</w:t>
+      </w:r>
+      <w:r>
+        <w:rPr>
+          <w:b/>
+          <w:bCs/>
+        </w:rPr>
+        <w:t xml:space="preserve"> </w:t>
+      </w:r>
+      <w:r>
+        <w:rPr>
+          <w:b/>
+          <w:bCs/>
+        </w:rPr>
+        <w:t>Document Reviewer</w:t>
+      </w:r>
+      <w:r>
+        <w:rPr>
+          <w:b/>
+          <w:bCs/>
+        </w:rPr>
+        <w:t>:</w:t>
+      </w:r>
+      <w:r>
+        <w:t xml:space="preserve"> </w:t>
+      </w:r>
+      <w:r>
+        <w:t>Responsible for</w:t>
+      </w:r>
+      <w:r>
+        <w:t xml:space="preserve"> </w:t>
+      </w:r>
+      <w:r>
+        <w:t xml:space="preserve">creating files and </w:t>
+      </w:r>
+      <w:r>
+        <w:t xml:space="preserve">maintaining </w:t>
+      </w:r>
+      <w:r>
+        <w:t xml:space="preserve">a clean and organized </w:t>
+      </w:r>
+      <w:r>
+        <w:t xml:space="preserve">workspace that is shared by </w:t>
+      </w:r>
+      <w:r>
+        <w:t>the team</w:t>
+      </w:r>
+      <w:r>
+        <w:t>.  Also makes sur</w:t>
+      </w:r>
+      <w:r>
+        <w:t>e that documentation is up to date</w:t>
+      </w:r>
+      <w:r>
+        <w:t xml:space="preserve">, </w:t>
+      </w:r>
+      <w:r>
+        <w:t xml:space="preserve">checked for </w:t>
+      </w:r>
+      <w:r>
+        <w:t>formatting</w:t>
+      </w:r>
+      <w:r>
+        <w:t xml:space="preserve"> issues, and </w:t>
+      </w:r>
+      <w:r>
+        <w:t xml:space="preserve">making sure every </w:t>
+      </w:r>
+      <w:r>
+        <w:t xml:space="preserve">document </w:t>
+      </w:r>
+      <w:r>
+        <w:t>is accessible to everyone.</w:t>
+      </w:r>
     </w:p>
     <w:p/>
+    <w:p>
+      <w:r>
+        <w:t>All team</w:t>
+      </w:r>
+      <w:r>
+        <w:t xml:space="preserve"> members</w:t>
+      </w:r>
+      <w:r>
+        <w:t xml:space="preserve"> are to be held accountable for </w:t>
+      </w:r>
+      <w:r>
+        <w:t>their own work</w:t>
+      </w:r>
+      <w:r>
+        <w:t xml:space="preserve">; Every task will have a team member </w:t>
+      </w:r>
+      <w:r>
+        <w:t>assigned to it</w:t>
+      </w:r>
+      <w:r>
+        <w:t>.</w:t>
+      </w:r>
+    </w:p>
     <w:p>
       <w:pPr>
         <w:pStyle w:val="Heading1"/>

</xml_diff>